<commit_message>
Removed Address, Phone and Email
</commit_message>
<xml_diff>
--- a/tool/static/Final Template.docx
+++ b/tool/static/Final Template.docx
@@ -129,7 +129,7 @@
           <w:b/>
           <w:bCs/>
         </w:rPr>
-        <w:t xml:space="preserve">                                                                      Jaswanth Kumaar Sampath Kumar</w:t>
+        <w:t xml:space="preserve">                                                                      </w:t>
       </w:r>
       <w:r>
         <w:rPr>
@@ -230,7 +230,7 @@
           <w:sz w:val="20"/>
           <w:szCs w:val="20"/>
         </w:rPr>
-        <w:t xml:space="preserve">5816 North Street, Unit 1, Halifax, NS B3K1N7</w:t>
+        <w:t xml:space="preserve"/>
       </w:r>
       <w:r>
         <w:rPr>
@@ -260,7 +260,7 @@
           <w:sz w:val="20"/>
           <w:szCs w:val="20"/>
         </w:rPr>
-        <w:t xml:space="preserve">+1 (902) 580-7636</w:t>
+        <w:t xml:space="preserve"/>
       </w:r>
       <w:r>
         <w:rPr>
@@ -290,7 +290,7 @@
           <w:sz w:val="20"/>
           <w:szCs w:val="20"/>
         </w:rPr>
-        <w:t xml:space="preserve">jaswanthkumaar20@gmail.com</w:t>
+        <w:t xml:space="preserve"/>
       </w:r>
       <w:r>
         <w:rPr>
@@ -420,7 +420,7 @@
           <w:sz w:val="18"/>
           <w:szCs w:val="18"/>
         </w:rPr>
-        <w:t xml:space="preserve">Proactive professional with a strong work ethic and meticulous attention to detail. Exceptional time management skills, capable of working independently or collaboratively. Committed to delivering results and eager to embrace new challenges, including assuming leadership responsibilities.</w:t>
+        <w:t xml:space="preserve"/>
       </w:r>
     </w:p>
     <w:p>
@@ -486,15 +486,7 @@
           <w:sz w:val="18"/>
           <w:szCs w:val="18"/>
         </w:rPr>
-        <w:t xml:space="preserve">- Python: Expert</w:t>
-        <w:br/>
-        <w:t xml:space="preserve">- R: Experienced</w:t>
-        <w:br/>
-        <w:t xml:space="preserve">- SQL: Expert</w:t>
-        <w:br/>
-        <w:t xml:space="preserve">- C++: Expert</w:t>
-        <w:br/>
-        <w:t xml:space="preserve">- JavaScript: Expert/Skillful</w:t>
+        <w:t xml:space="preserve"/>
       </w:r>
     </w:p>
     <w:p>

</xml_diff>